<commit_message>
Unifica municípios do Extrato de Contrato. Gera um por município.
</commit_message>
<xml_diff>
--- a/templates/documentos/modelo_extrato_contrato.docx
+++ b/templates/documentos/modelo_extrato_contrato.docx
@@ -189,37 +189,34 @@
           <w:sz w:val="24"/>
           <w:szCs w:val="24"/>
         </w:rPr>
-        <w:t xml:space="preserve">nte, para aquisição de gêneros alimentícios, para compor a alimentação escolar do município de </w:t>
-      </w:r>
-      <w:r>
-        <w:rPr>
-          <w:b/>
-          <w:bCs/>
-          <w:color w:val="000000"/>
-          <w:sz w:val="24"/>
-          <w:szCs w:val="24"/>
-        </w:rPr>
-        <w:t>{{NOME DO MUNICÍPIO}}</w:t>
-      </w:r>
-      <w:r>
-        <w:rPr>
-          <w:b/>
-          <w:bCs/>
-          <w:color w:val="000000"/>
-          <w:sz w:val="24"/>
-          <w:szCs w:val="24"/>
-        </w:rPr>
-        <w:t>/</w:t>
-      </w:r>
-      <w:r>
-        <w:rPr>
-          <w:b/>
-          <w:bCs/>
-          <w:color w:val="000000"/>
-          <w:sz w:val="24"/>
-          <w:szCs w:val="24"/>
-        </w:rPr>
-        <w:t>{{ESTADO DO MUNICÍPIO}}</w:t>
+        <w:t>nte, para aquisição de gêneros alimentícios, para compor a alimentação escolar {{ABRANGÊNCIA MUNICÍPIOS}}</w:t>
+      </w:r>
+      <w:r>
+        <w:rPr>
+          <w:b/>
+          <w:bCs/>
+          <w:color w:val="000000"/>
+          <w:sz w:val="24"/>
+          <w:szCs w:val="24"/>
+        </w:rPr>
+      </w:r>
+      <w:r>
+        <w:rPr>
+          <w:b/>
+          <w:bCs/>
+          <w:color w:val="000000"/>
+          <w:sz w:val="24"/>
+          <w:szCs w:val="24"/>
+        </w:rPr>
+      </w:r>
+      <w:r>
+        <w:rPr>
+          <w:b/>
+          <w:bCs/>
+          <w:color w:val="000000"/>
+          <w:sz w:val="24"/>
+          <w:szCs w:val="24"/>
+        </w:rPr>
       </w:r>
       <w:r>
         <w:rPr>

</xml_diff>